<commit_message>
TS6 done praise King Jesus Christ our LORD
</commit_message>
<xml_diff>
--- a/41TS Tehnologiji stvorennja program/6/TS_Onyshchenko_KNT-122_19_PR6.docx
+++ b/41TS Tehnologiji stvorennja program/6/TS_Onyshchenko_KNT-122_19_PR6.docx
@@ -509,34 +509,620 @@
         <w:rPr>
           <w:b w:val="false"/>
           <w:bCs w:val="false"/>
+          <w:i w:val="false"/>
+          <w:iCs w:val="false"/>
+          <w:lang w:val="uk-UA"/>
+        </w:rPr>
+        <w:t>Застосунок Біблійного пошуку.</w:t>
+      </w:r>
+    </w:p>
+    <w:p>
+      <w:pPr>
+        <w:pStyle w:val="p1"/>
+        <w:rPr>
+          <w:lang w:val="uk-UA"/>
+        </w:rPr>
+      </w:pPr>
+      <w:r>
+        <w:rPr>
+          <w:lang w:val="uk-UA"/>
+        </w:rPr>
+      </w:r>
+    </w:p>
+    <w:p>
+      <w:pPr>
+        <w:pStyle w:val="h1"/>
+        <w:rPr/>
+      </w:pPr>
+      <w:r>
+        <w:rPr/>
+        <w:t>Завдання</w:t>
+      </w:r>
+    </w:p>
+    <w:p>
+      <w:pPr>
+        <w:pStyle w:val="p1"/>
+        <w:rPr>
+          <w:lang w:val="uk-UA"/>
+        </w:rPr>
+      </w:pPr>
+      <w:r>
+        <w:rPr>
+          <w:lang w:val="uk-UA"/>
+        </w:rPr>
+      </w:r>
+    </w:p>
+    <w:p>
+      <w:pPr>
+        <w:pStyle w:val="p1"/>
+        <w:rPr>
+          <w:lang w:val="uk-UA"/>
+        </w:rPr>
+      </w:pPr>
+      <w:r>
+        <w:rPr>
+          <w:lang w:val="uk-UA"/>
+        </w:rPr>
+        <w:t xml:space="preserve">Завдання на роботу зі </w:t>
+      </w:r>
+      <w:r>
+        <w:rPr>
           <w:i/>
           <w:iCs/>
           <w:lang w:val="uk-UA"/>
         </w:rPr>
-        <w:t xml:space="preserve">Тема. </w:t>
-      </w:r>
-      <w:r>
-        <w:rPr>
-          <w:b w:val="false"/>
-          <w:bCs w:val="false"/>
+        <w:t>сторінки 70</w:t>
+      </w:r>
+      <w:r>
+        <w:rPr>
+          <w:lang w:val="uk-UA"/>
+        </w:rPr>
+        <w:t>:</w:t>
+      </w:r>
+    </w:p>
+    <w:p>
+      <w:pPr>
+        <w:pStyle w:val="p1"/>
+        <w:rPr>
+          <w:lang w:val="uk-UA"/>
+        </w:rPr>
+      </w:pPr>
+      <w:r>
+        <w:rPr>
+          <w:lang w:val="uk-UA"/>
+        </w:rPr>
+      </w:r>
+    </w:p>
+    <w:p>
+      <w:pPr>
+        <w:pStyle w:val="p1"/>
+        <w:rPr>
+          <w:lang w:val="uk-UA"/>
+        </w:rPr>
+      </w:pPr>
+      <w:r>
+        <w:rPr>
+          <w:lang w:val="uk-UA"/>
+        </w:rPr>
+        <w:t>1. Ознайомитися з теоретичними відомостями, необхідними для виконання роботи.</w:t>
+      </w:r>
+    </w:p>
+    <w:p>
+      <w:pPr>
+        <w:pStyle w:val="p1"/>
+        <w:rPr>
+          <w:lang w:val="uk-UA"/>
+        </w:rPr>
+      </w:pPr>
+      <w:r>
+        <w:rPr>
+          <w:lang w:val="uk-UA"/>
+        </w:rPr>
+        <w:t>2. Відправити (push) першу версію свого проєкту до репозиторію на GitLab, додавши його як віддалений і відправивши гілку.</w:t>
+      </w:r>
+    </w:p>
+    <w:p>
+      <w:pPr>
+        <w:pStyle w:val="p1"/>
+        <w:rPr>
+          <w:lang w:val="uk-UA"/>
+        </w:rPr>
+      </w:pPr>
+      <w:r>
+        <w:rPr>
+          <w:lang w:val="uk-UA"/>
+        </w:rPr>
+        <w:t>3. Реалізувати основні функціональні вимоги до системи.</w:t>
+      </w:r>
+    </w:p>
+    <w:p>
+      <w:pPr>
+        <w:pStyle w:val="p1"/>
+        <w:rPr>
+          <w:lang w:val="uk-UA"/>
+        </w:rPr>
+      </w:pPr>
+      <w:r>
+        <w:rPr>
+          <w:lang w:val="uk-UA"/>
+        </w:rPr>
+        <w:t>4. Відправити (push) до репозиторію зміни (реалізовані функціональні вимоги).</w:t>
+      </w:r>
+    </w:p>
+    <w:p>
+      <w:pPr>
+        <w:pStyle w:val="p1"/>
+        <w:rPr>
+          <w:lang w:val="uk-UA"/>
+        </w:rPr>
+      </w:pPr>
+      <w:r>
+        <w:rPr>
+          <w:lang w:val="uk-UA"/>
+        </w:rPr>
+        <w:t>5. Оформити звіт з роботи.</w:t>
+      </w:r>
+    </w:p>
+    <w:p>
+      <w:pPr>
+        <w:pStyle w:val="p1"/>
+        <w:rPr>
+          <w:lang w:val="uk-UA"/>
+        </w:rPr>
+      </w:pPr>
+      <w:r>
+        <w:rPr>
+          <w:lang w:val="uk-UA"/>
+        </w:rPr>
+        <w:t>6. Відповісти на контрольні питання.</w:t>
+      </w:r>
+    </w:p>
+    <w:p>
+      <w:pPr>
+        <w:pStyle w:val="p1"/>
+        <w:rPr>
+          <w:lang w:val="uk-UA"/>
+        </w:rPr>
+      </w:pPr>
+      <w:r>
+        <w:rPr>
+          <w:lang w:val="uk-UA"/>
+        </w:rPr>
+      </w:r>
+    </w:p>
+    <w:p>
+      <w:pPr>
+        <w:pStyle w:val="h1"/>
+        <w:rPr/>
+      </w:pPr>
+      <w:r>
+        <w:rPr/>
+        <w:t>Скріншоти та сирцевий код веб-сторінок</w:t>
+      </w:r>
+    </w:p>
+    <w:p>
+      <w:pPr>
+        <w:pStyle w:val="p1"/>
+        <w:rPr/>
+      </w:pPr>
+      <w:r>
+        <w:rPr/>
+      </w:r>
+    </w:p>
+    <w:p>
+      <w:pPr>
+        <w:pStyle w:val="p1"/>
+        <w:rPr/>
+      </w:pPr>
+      <w:r>
+        <w:rPr/>
+        <w:t xml:space="preserve">До проєкту додано нову сторінку: </w:t>
+      </w:r>
+      <w:r>
+        <w:rPr>
+          <w:i/>
+          <w:iCs/>
+          <w:lang w:val="en-US"/>
+        </w:rPr>
+        <w:t>about.html.</w:t>
+      </w:r>
+    </w:p>
+    <w:p>
+      <w:pPr>
+        <w:pStyle w:val="p1"/>
+        <w:rPr>
+          <w:i/>
+          <w:i/>
+          <w:iCs/>
+          <w:lang w:val="en-US"/>
+        </w:rPr>
+      </w:pPr>
+      <w:r>
+        <w:rPr>
+          <w:i/>
+          <w:iCs/>
+          <w:lang w:val="en-US"/>
+        </w:rPr>
+      </w:r>
+    </w:p>
+    <w:p>
+      <w:pPr>
+        <w:pStyle w:val="h21"/>
+        <w:rPr/>
+      </w:pPr>
+      <w:r>
+        <w:rPr/>
+        <w:t>Код</w:t>
+      </w:r>
+    </w:p>
+    <w:p>
+      <w:pPr>
+        <w:pStyle w:val="p1"/>
+        <w:rPr>
+          <w:i w:val="false"/>
           <w:i w:val="false"/>
           <w:iCs w:val="false"/>
           <w:lang w:val="uk-UA"/>
         </w:rPr>
-        <w:t>Застосунок Біблійного пошуку.</w:t>
-      </w:r>
-    </w:p>
-    <w:p>
-      <w:pPr>
-        <w:pStyle w:val="p1"/>
-        <w:rPr>
-          <w:lang w:val="uk-UA"/>
-        </w:rPr>
-      </w:pPr>
-      <w:r>
-        <w:rPr>
-          <w:lang w:val="uk-UA"/>
-        </w:rPr>
+      </w:pPr>
+      <w:r>
+        <w:rPr>
+          <w:i w:val="false"/>
+          <w:iCs w:val="false"/>
+          <w:lang w:val="uk-UA"/>
+        </w:rPr>
+      </w:r>
+    </w:p>
+    <w:p>
+      <w:pPr>
+        <w:pStyle w:val="code1"/>
+        <w:rPr/>
+      </w:pPr>
+      <w:r>
+        <w:rPr/>
+        <w:t>{% extends "base.html" %} {% block title %}Про застосунок{%endblock %} {% block content %}</w:t>
+      </w:r>
+    </w:p>
+    <w:p>
+      <w:pPr>
+        <w:pStyle w:val="code1"/>
+        <w:rPr/>
+      </w:pPr>
+      <w:r>
+        <w:rPr/>
+        <w:t>&lt;article class="flex-col flex gap-4"&gt;</w:t>
+      </w:r>
+    </w:p>
+    <w:p>
+      <w:pPr>
+        <w:pStyle w:val="code1"/>
+        <w:rPr/>
+      </w:pPr>
+      <w:r>
+        <w:rPr/>
+        <w:t xml:space="preserve">  </w:t>
+      </w:r>
+      <w:r>
+        <w:rPr/>
+        <w:t>&lt;h1 class="border-l-2 border-lime-500 px-2 text-lg"&gt;</w:t>
+      </w:r>
+      <w:r>
+        <w:rPr/>
+        <w:t>{{ title }}</w:t>
+      </w:r>
+      <w:r>
+        <w:rPr/>
+        <w:t>&lt;/h1&gt;</w:t>
+      </w:r>
+    </w:p>
+    <w:p>
+      <w:pPr>
+        <w:pStyle w:val="code1"/>
+        <w:rPr/>
+      </w:pPr>
+      <w:r>
+        <w:rPr/>
+        <w:t xml:space="preserve">  </w:t>
+      </w:r>
+      <w:r>
+        <w:rPr/>
+        <w:t>&lt;p&gt;</w:t>
+      </w:r>
+    </w:p>
+    <w:p>
+      <w:pPr>
+        <w:pStyle w:val="code1"/>
+        <w:rPr/>
+      </w:pPr>
+      <w:r>
+        <w:rPr/>
+        <w:t xml:space="preserve">    </w:t>
+      </w:r>
+      <w:r>
+        <w:rPr/>
+        <w:t>Застосунок використовує API від</w:t>
+      </w:r>
+    </w:p>
+    <w:p>
+      <w:pPr>
+        <w:pStyle w:val="code1"/>
+        <w:rPr/>
+      </w:pPr>
+      <w:r>
+        <w:rPr/>
+        <w:t xml:space="preserve">    </w:t>
+      </w:r>
+      <w:r>
+        <w:rPr/>
+        <w:t>&lt;a</w:t>
+      </w:r>
+    </w:p>
+    <w:p>
+      <w:pPr>
+        <w:pStyle w:val="code1"/>
+        <w:rPr/>
+      </w:pPr>
+      <w:r>
+        <w:rPr/>
+        <w:t xml:space="preserve">      </w:t>
+      </w:r>
+      <w:r>
+        <w:rPr/>
+        <w:t>class="underline underline-offset-4 decoration-lime-500 cursor-pointer"</w:t>
+      </w:r>
+    </w:p>
+    <w:p>
+      <w:pPr>
+        <w:pStyle w:val="code1"/>
+        <w:rPr/>
+      </w:pPr>
+      <w:r>
+        <w:rPr/>
+        <w:t xml:space="preserve">      </w:t>
+      </w:r>
+      <w:r>
+        <w:rPr/>
+        <w:t>href="https://bolls.life/api/"</w:t>
+      </w:r>
+    </w:p>
+    <w:p>
+      <w:pPr>
+        <w:pStyle w:val="code1"/>
+        <w:rPr/>
+      </w:pPr>
+      <w:r>
+        <w:rPr/>
+        <w:t xml:space="preserve">      </w:t>
+      </w:r>
+      <w:r>
+        <w:rPr/>
+        <w:t>&gt;bolls.life&lt;/a</w:t>
+      </w:r>
+    </w:p>
+    <w:p>
+      <w:pPr>
+        <w:pStyle w:val="code1"/>
+        <w:rPr/>
+      </w:pPr>
+      <w:r>
+        <w:rPr/>
+        <w:t xml:space="preserve">    </w:t>
+      </w:r>
+      <w:r>
+        <w:rPr/>
+        <w:t>&gt;.</w:t>
+      </w:r>
+    </w:p>
+    <w:p>
+      <w:pPr>
+        <w:pStyle w:val="code1"/>
+        <w:rPr/>
+      </w:pPr>
+      <w:r>
+        <w:rPr/>
+        <w:t xml:space="preserve">  </w:t>
+      </w:r>
+      <w:r>
+        <w:rPr/>
+        <w:t>&lt;/p&gt;</w:t>
+      </w:r>
+    </w:p>
+    <w:p>
+      <w:pPr>
+        <w:pStyle w:val="code1"/>
+        <w:rPr/>
+      </w:pPr>
+      <w:r>
+        <w:rPr/>
+        <w:t xml:space="preserve">  </w:t>
+      </w:r>
+      <w:r>
+        <w:rPr/>
+        <w:t>&lt;h2 class="border-l-2 border-lime-500 px-2 mt-3"&gt;Можливості&lt;/h2&gt;</w:t>
+      </w:r>
+    </w:p>
+    <w:p>
+      <w:pPr>
+        <w:pStyle w:val="code1"/>
+        <w:rPr/>
+      </w:pPr>
+      <w:r>
+        <w:rPr/>
+        <w:t xml:space="preserve">  </w:t>
+      </w:r>
+      <w:r>
+        <w:rPr/>
+        <w:t>&lt;ol class="list-inside list-decimal"&gt;</w:t>
+      </w:r>
+    </w:p>
+    <w:p>
+      <w:pPr>
+        <w:pStyle w:val="code1"/>
+        <w:rPr/>
+      </w:pPr>
+      <w:r>
+        <w:rPr/>
+        <w:t xml:space="preserve">    </w:t>
+      </w:r>
+      <w:r>
+        <w:rPr/>
+        <w:t>&lt;li&gt;Пошук за ключовим словом&lt;/li&gt;</w:t>
+      </w:r>
+    </w:p>
+    <w:p>
+      <w:pPr>
+        <w:pStyle w:val="code1"/>
+        <w:rPr/>
+      </w:pPr>
+      <w:r>
+        <w:rPr/>
+        <w:t xml:space="preserve">    </w:t>
+      </w:r>
+      <w:r>
+        <w:rPr/>
+        <w:t>&lt;li&gt;Пам'ять пошуків&lt;/li&gt;</w:t>
+      </w:r>
+    </w:p>
+    <w:p>
+      <w:pPr>
+        <w:pStyle w:val="code1"/>
+        <w:rPr/>
+      </w:pPr>
+      <w:r>
+        <w:rPr/>
+        <w:t xml:space="preserve">  </w:t>
+      </w:r>
+      <w:r>
+        <w:rPr/>
+        <w:t>&lt;/ol&gt;</w:t>
+      </w:r>
+    </w:p>
+    <w:p>
+      <w:pPr>
+        <w:pStyle w:val="code1"/>
+        <w:rPr/>
+      </w:pPr>
+      <w:r>
+        <w:rPr/>
+        <w:t xml:space="preserve">  </w:t>
+      </w:r>
+      <w:r>
+        <w:rPr/>
+        <w:t>&lt;a href="{% url "index" %}" class="underline underline-offset-4 decoration-lime-500 cursor-pointer"&gt;Назад на головну&lt;/a&gt;</w:t>
+      </w:r>
+    </w:p>
+    <w:p>
+      <w:pPr>
+        <w:pStyle w:val="code1"/>
+        <w:rPr/>
+      </w:pPr>
+      <w:r>
+        <w:rPr/>
+        <w:t>&lt;/article&gt;</w:t>
+      </w:r>
+    </w:p>
+    <w:p>
+      <w:pPr>
+        <w:pStyle w:val="code1"/>
+        <w:rPr/>
+      </w:pPr>
+      <w:r>
+        <w:rPr/>
+        <w:t>{% endblock %}</w:t>
+      </w:r>
+    </w:p>
+    <w:p>
+      <w:pPr>
+        <w:pStyle w:val="p1"/>
+        <w:rPr/>
+      </w:pPr>
+      <w:r>
+        <w:rPr/>
+      </w:r>
+    </w:p>
+    <w:p>
+      <w:pPr>
+        <w:pStyle w:val="h21"/>
+        <w:rPr/>
+      </w:pPr>
+      <w:r>
+        <w:rPr/>
+        <w:t>Вигляд</w:t>
+      </w:r>
+    </w:p>
+    <w:p>
+      <w:pPr>
+        <w:pStyle w:val="p1"/>
+        <w:rPr/>
+      </w:pPr>
+      <w:r>
+        <w:rPr/>
+      </w:r>
+    </w:p>
+    <w:p>
+      <w:pPr>
+        <w:pStyle w:val="img1"/>
+        <w:rPr/>
+      </w:pPr>
+      <w:r>
+        <w:rPr/>
+        <w:drawing>
+          <wp:inline distT="0" distB="0" distL="0" distR="0">
+            <wp:extent cx="5760085" cy="1922145"/>
+            <wp:effectExtent l="0" t="0" r="0" b="0"/>
+            <wp:docPr id="1" name="Зображення1"/>
+            <wp:cNvGraphicFramePr>
+              <a:graphicFrameLocks xmlns:a="http://schemas.openxmlformats.org/drawingml/2006/main" noChangeAspect="1"/>
+            </wp:cNvGraphicFramePr>
+            <a:graphic xmlns:a="http://schemas.openxmlformats.org/drawingml/2006/main">
+              <a:graphicData uri="http://schemas.openxmlformats.org/drawingml/2006/picture">
+                <pic:pic xmlns:pic="http://schemas.openxmlformats.org/drawingml/2006/picture">
+                  <pic:nvPicPr>
+                    <pic:cNvPr id="1" name="Зображення1"/>
+                    <pic:cNvPicPr>
+                      <a:picLocks noChangeAspect="1" noChangeArrowheads="1"/>
+                    </pic:cNvPicPr>
+                  </pic:nvPicPr>
+                  <pic:blipFill>
+                    <a:blip r:embed="rId2"/>
+                    <a:stretch>
+                      <a:fillRect/>
+                    </a:stretch>
+                  </pic:blipFill>
+                  <pic:spPr bwMode="auto">
+                    <a:xfrm>
+                      <a:off x="0" y="0"/>
+                      <a:ext cx="5760085" cy="1922145"/>
+                    </a:xfrm>
+                    <a:prstGeom prst="rect">
+                      <a:avLst/>
+                    </a:prstGeom>
+                    <a:noFill/>
+                  </pic:spPr>
+                </pic:pic>
+              </a:graphicData>
+            </a:graphic>
+          </wp:inline>
+        </w:drawing>
+      </w:r>
+    </w:p>
+    <w:p>
+      <w:pPr>
+        <w:pStyle w:val="img1"/>
+        <w:rPr/>
+      </w:pPr>
+      <w:r>
+        <w:rPr/>
+        <w:t>Рисунок 1.1 — Вигляд нової сторінки</w:t>
+      </w:r>
+    </w:p>
+    <w:p>
+      <w:pPr>
+        <w:pStyle w:val="p1"/>
+        <w:rPr/>
+      </w:pPr>
+      <w:r>
+        <w:rPr/>
       </w:r>
     </w:p>
     <w:p>
@@ -546,177 +1132,6 @@
       </w:pPr>
       <w:r>
         <w:rPr/>
-        <w:t>Завдання</w:t>
-      </w:r>
-    </w:p>
-    <w:p>
-      <w:pPr>
-        <w:pStyle w:val="p1"/>
-        <w:rPr>
-          <w:lang w:val="uk-UA"/>
-        </w:rPr>
-      </w:pPr>
-      <w:r>
-        <w:rPr>
-          <w:lang w:val="uk-UA"/>
-        </w:rPr>
-      </w:r>
-    </w:p>
-    <w:p>
-      <w:pPr>
-        <w:pStyle w:val="p1"/>
-        <w:rPr>
-          <w:lang w:val="uk-UA"/>
-        </w:rPr>
-      </w:pPr>
-      <w:r>
-        <w:rPr>
-          <w:lang w:val="uk-UA"/>
-        </w:rPr>
-        <w:t xml:space="preserve">Завдання на роботу зі </w:t>
-      </w:r>
-      <w:r>
-        <w:rPr>
-          <w:i/>
-          <w:iCs/>
-          <w:lang w:val="uk-UA"/>
-        </w:rPr>
-        <w:t>сторінки 70</w:t>
-      </w:r>
-      <w:r>
-        <w:rPr>
-          <w:lang w:val="uk-UA"/>
-        </w:rPr>
-        <w:t>:</w:t>
-      </w:r>
-    </w:p>
-    <w:p>
-      <w:pPr>
-        <w:pStyle w:val="p1"/>
-        <w:rPr>
-          <w:lang w:val="uk-UA"/>
-        </w:rPr>
-      </w:pPr>
-      <w:r>
-        <w:rPr>
-          <w:lang w:val="uk-UA"/>
-        </w:rPr>
-      </w:r>
-    </w:p>
-    <w:p>
-      <w:pPr>
-        <w:pStyle w:val="p1"/>
-        <w:rPr>
-          <w:lang w:val="uk-UA"/>
-        </w:rPr>
-      </w:pPr>
-      <w:r>
-        <w:rPr>
-          <w:lang w:val="uk-UA"/>
-        </w:rPr>
-        <w:t>1. Ознайомитися з теоретичними відомостями, необхідними для виконання роботи.</w:t>
-      </w:r>
-    </w:p>
-    <w:p>
-      <w:pPr>
-        <w:pStyle w:val="p1"/>
-        <w:rPr>
-          <w:lang w:val="uk-UA"/>
-        </w:rPr>
-      </w:pPr>
-      <w:r>
-        <w:rPr>
-          <w:lang w:val="uk-UA"/>
-        </w:rPr>
-        <w:t>2. Відправити (push) першу версію свого проєкту до репозиторію на GitLab, додавши його як віддалений і відправивши гілку.</w:t>
-      </w:r>
-    </w:p>
-    <w:p>
-      <w:pPr>
-        <w:pStyle w:val="p1"/>
-        <w:rPr>
-          <w:lang w:val="uk-UA"/>
-        </w:rPr>
-      </w:pPr>
-      <w:r>
-        <w:rPr>
-          <w:lang w:val="uk-UA"/>
-        </w:rPr>
-        <w:t>3. Реалізувати основні функціональні вимоги до системи.</w:t>
-      </w:r>
-    </w:p>
-    <w:p>
-      <w:pPr>
-        <w:pStyle w:val="p1"/>
-        <w:rPr>
-          <w:lang w:val="uk-UA"/>
-        </w:rPr>
-      </w:pPr>
-      <w:r>
-        <w:rPr>
-          <w:lang w:val="uk-UA"/>
-        </w:rPr>
-        <w:t>4. Відправити (push) до репозиторію зміни (реалізовані функціональні вимоги).</w:t>
-      </w:r>
-    </w:p>
-    <w:p>
-      <w:pPr>
-        <w:pStyle w:val="p1"/>
-        <w:rPr>
-          <w:lang w:val="uk-UA"/>
-        </w:rPr>
-      </w:pPr>
-      <w:r>
-        <w:rPr>
-          <w:lang w:val="uk-UA"/>
-        </w:rPr>
-        <w:t>5. Оформити звіт з роботи.</w:t>
-      </w:r>
-    </w:p>
-    <w:p>
-      <w:pPr>
-        <w:pStyle w:val="p1"/>
-        <w:rPr>
-          <w:lang w:val="uk-UA"/>
-        </w:rPr>
-      </w:pPr>
-      <w:r>
-        <w:rPr>
-          <w:lang w:val="uk-UA"/>
-        </w:rPr>
-        <w:t>6. Відповісти на контрольні питання.</w:t>
-      </w:r>
-    </w:p>
-    <w:p>
-      <w:pPr>
-        <w:pStyle w:val="p1"/>
-        <w:rPr>
-          <w:lang w:val="uk-UA"/>
-        </w:rPr>
-      </w:pPr>
-      <w:r>
-        <w:rPr>
-          <w:lang w:val="uk-UA"/>
-        </w:rPr>
-      </w:r>
-    </w:p>
-    <w:p>
-      <w:pPr>
-        <w:pStyle w:val="h1"/>
-        <w:rPr/>
-      </w:pPr>
-      <w:r>
-        <w:rPr/>
-        <w:t>Скріншоти та сирцевий код веб-сторінок</w:t>
-      </w:r>
-    </w:p>
-    <w:p>
-      <w:pPr>
-        <w:pStyle w:val="h1"/>
-        <w:rPr/>
-      </w:pPr>
-      <w:r>
-        <w:rPr/>
         <w:t xml:space="preserve">Скріншоти роботи із </w:t>
       </w:r>
       <w:r>
@@ -728,6 +1143,238 @@
       <w:r>
         <w:rPr/>
         <w:t>репозиторієм</w:t>
+      </w:r>
+    </w:p>
+    <w:p>
+      <w:pPr>
+        <w:pStyle w:val="p1"/>
+        <w:rPr/>
+      </w:pPr>
+      <w:r>
+        <w:rPr/>
+      </w:r>
+    </w:p>
+    <w:p>
+      <w:pPr>
+        <w:pStyle w:val="p1"/>
+        <w:rPr/>
+      </w:pPr>
+      <w:r>
+        <w:rPr/>
+        <w:t>Процес роботи з репозиторієм описано нижче картинками:</w:t>
+      </w:r>
+    </w:p>
+    <w:p>
+      <w:pPr>
+        <w:pStyle w:val="img1"/>
+        <w:rPr/>
+      </w:pPr>
+      <w:r>
+        <w:rPr/>
+      </w:r>
+    </w:p>
+    <w:p>
+      <w:pPr>
+        <w:pStyle w:val="img1"/>
+        <w:rPr/>
+      </w:pPr>
+      <w:r>
+        <w:rPr/>
+        <w:drawing>
+          <wp:inline distT="0" distB="0" distL="0" distR="0">
+            <wp:extent cx="5760085" cy="6901815"/>
+            <wp:effectExtent l="0" t="0" r="0" b="0"/>
+            <wp:docPr id="2" name="Зображення2"/>
+            <wp:cNvGraphicFramePr>
+              <a:graphicFrameLocks xmlns:a="http://schemas.openxmlformats.org/drawingml/2006/main" noChangeAspect="1"/>
+            </wp:cNvGraphicFramePr>
+            <a:graphic xmlns:a="http://schemas.openxmlformats.org/drawingml/2006/main">
+              <a:graphicData uri="http://schemas.openxmlformats.org/drawingml/2006/picture">
+                <pic:pic xmlns:pic="http://schemas.openxmlformats.org/drawingml/2006/picture">
+                  <pic:nvPicPr>
+                    <pic:cNvPr id="2" name="Зображення2"/>
+                    <pic:cNvPicPr>
+                      <a:picLocks noChangeAspect="1" noChangeArrowheads="1"/>
+                    </pic:cNvPicPr>
+                  </pic:nvPicPr>
+                  <pic:blipFill>
+                    <a:blip r:embed="rId3"/>
+                    <a:stretch>
+                      <a:fillRect/>
+                    </a:stretch>
+                  </pic:blipFill>
+                  <pic:spPr bwMode="auto">
+                    <a:xfrm>
+                      <a:off x="0" y="0"/>
+                      <a:ext cx="5760085" cy="6901815"/>
+                    </a:xfrm>
+                    <a:prstGeom prst="rect">
+                      <a:avLst/>
+                    </a:prstGeom>
+                    <a:noFill/>
+                  </pic:spPr>
+                </pic:pic>
+              </a:graphicData>
+            </a:graphic>
+          </wp:inline>
+        </w:drawing>
+      </w:r>
+    </w:p>
+    <w:p>
+      <w:pPr>
+        <w:pStyle w:val="img1"/>
+        <w:rPr/>
+      </w:pPr>
+      <w:r>
+        <w:rPr/>
+        <w:t xml:space="preserve">Рисунок 2.1 — Нова сторінка </w:t>
+      </w:r>
+      <w:r>
+        <w:rPr>
+          <w:lang w:val="en-US"/>
+        </w:rPr>
+        <w:t>GitLab</w:t>
+      </w:r>
+    </w:p>
+    <w:p>
+      <w:pPr>
+        <w:pStyle w:val="img1"/>
+        <w:rPr/>
+      </w:pPr>
+      <w:r>
+        <w:rPr/>
+      </w:r>
+    </w:p>
+    <w:p>
+      <w:pPr>
+        <w:pStyle w:val="img1"/>
+        <w:rPr/>
+      </w:pPr>
+      <w:r>
+        <w:rPr/>
+        <w:drawing>
+          <wp:inline distT="0" distB="0" distL="0" distR="0">
+            <wp:extent cx="5760085" cy="6944360"/>
+            <wp:effectExtent l="0" t="0" r="0" b="0"/>
+            <wp:docPr id="3" name="Зображення3"/>
+            <wp:cNvGraphicFramePr>
+              <a:graphicFrameLocks xmlns:a="http://schemas.openxmlformats.org/drawingml/2006/main" noChangeAspect="1"/>
+            </wp:cNvGraphicFramePr>
+            <a:graphic xmlns:a="http://schemas.openxmlformats.org/drawingml/2006/main">
+              <a:graphicData uri="http://schemas.openxmlformats.org/drawingml/2006/picture">
+                <pic:pic xmlns:pic="http://schemas.openxmlformats.org/drawingml/2006/picture">
+                  <pic:nvPicPr>
+                    <pic:cNvPr id="3" name="Зображення3"/>
+                    <pic:cNvPicPr>
+                      <a:picLocks noChangeAspect="1" noChangeArrowheads="1"/>
+                    </pic:cNvPicPr>
+                  </pic:nvPicPr>
+                  <pic:blipFill>
+                    <a:blip r:embed="rId4"/>
+                    <a:stretch>
+                      <a:fillRect/>
+                    </a:stretch>
+                  </pic:blipFill>
+                  <pic:spPr bwMode="auto">
+                    <a:xfrm>
+                      <a:off x="0" y="0"/>
+                      <a:ext cx="5760085" cy="6944360"/>
+                    </a:xfrm>
+                    <a:prstGeom prst="rect">
+                      <a:avLst/>
+                    </a:prstGeom>
+                    <a:noFill/>
+                  </pic:spPr>
+                </pic:pic>
+              </a:graphicData>
+            </a:graphic>
+          </wp:inline>
+        </w:drawing>
+      </w:r>
+    </w:p>
+    <w:p>
+      <w:pPr>
+        <w:pStyle w:val="img1"/>
+        <w:rPr/>
+      </w:pPr>
+      <w:r>
+        <w:rPr/>
+        <w:t>Рисунок 2.2 — Створення нового проєкту</w:t>
+      </w:r>
+    </w:p>
+    <w:p>
+      <w:pPr>
+        <w:pStyle w:val="img1"/>
+        <w:rPr/>
+      </w:pPr>
+      <w:r>
+        <w:rPr/>
+      </w:r>
+    </w:p>
+    <w:p>
+      <w:pPr>
+        <w:pStyle w:val="img1"/>
+        <w:rPr/>
+      </w:pPr>
+      <w:r>
+        <w:rPr/>
+        <w:drawing>
+          <wp:inline distT="0" distB="0" distL="0" distR="0">
+            <wp:extent cx="5760085" cy="6944360"/>
+            <wp:effectExtent l="0" t="0" r="0" b="0"/>
+            <wp:docPr id="4" name="Зображення4"/>
+            <wp:cNvGraphicFramePr>
+              <a:graphicFrameLocks xmlns:a="http://schemas.openxmlformats.org/drawingml/2006/main" noChangeAspect="1"/>
+            </wp:cNvGraphicFramePr>
+            <a:graphic xmlns:a="http://schemas.openxmlformats.org/drawingml/2006/main">
+              <a:graphicData uri="http://schemas.openxmlformats.org/drawingml/2006/picture">
+                <pic:pic xmlns:pic="http://schemas.openxmlformats.org/drawingml/2006/picture">
+                  <pic:nvPicPr>
+                    <pic:cNvPr id="4" name="Зображення4"/>
+                    <pic:cNvPicPr>
+                      <a:picLocks noChangeAspect="1" noChangeArrowheads="1"/>
+                    </pic:cNvPicPr>
+                  </pic:nvPicPr>
+                  <pic:blipFill>
+                    <a:blip r:embed="rId5"/>
+                    <a:stretch>
+                      <a:fillRect/>
+                    </a:stretch>
+                  </pic:blipFill>
+                  <pic:spPr bwMode="auto">
+                    <a:xfrm>
+                      <a:off x="0" y="0"/>
+                      <a:ext cx="5760085" cy="6944360"/>
+                    </a:xfrm>
+                    <a:prstGeom prst="rect">
+                      <a:avLst/>
+                    </a:prstGeom>
+                    <a:noFill/>
+                  </pic:spPr>
+                </pic:pic>
+              </a:graphicData>
+            </a:graphic>
+          </wp:inline>
+        </w:drawing>
+      </w:r>
+    </w:p>
+    <w:p>
+      <w:pPr>
+        <w:pStyle w:val="img1"/>
+        <w:rPr/>
+      </w:pPr>
+      <w:r>
+        <w:rPr/>
+        <w:t>Рисунок 2.3 — Додавання змін до репозиторію</w:t>
+      </w:r>
+    </w:p>
+    <w:p>
+      <w:pPr>
+        <w:pStyle w:val="p1"/>
+        <w:rPr/>
+      </w:pPr>
+      <w:r>
+        <w:rPr/>
       </w:r>
     </w:p>
     <w:p>

</xml_diff>